<commit_message>
exp: update MSTAR semi-supervised batch studies
</commit_message>
<xml_diff>
--- a/mstar_ssl_practice2_clean/report/组号-人工智能实训II-实践2.docx
+++ b/mstar_ssl_practice2_clean/report/组号-人工智能实训II-实践2.docx
@@ -129,7 +129,7 @@
           <w:b w:val="0"/>
           <w:sz w:val="24"/>
         </w:rPr>
-        <w:t>组    号    你的组号</w:t>
+        <w:t>组    号    待填写</w:t>
       </w:r>
     </w:p>
     <w:p>
@@ -142,7 +142,7 @@
           <w:b w:val="0"/>
           <w:sz w:val="24"/>
         </w:rPr>
-        <w:t>组    员    姓名1（学号后三位）、姓名2（学号后三位）</w:t>
+        <w:t>组    员    待填写</w:t>
       </w:r>
     </w:p>
     <w:p>
@@ -256,7 +256,7 @@
                 <w:b w:val="0"/>
                 <w:sz w:val="18"/>
               </w:rPr>
-              <w:t>姓名1（学号后三位）、姓名2（学号后三位）</w:t>
+              <w:t>待填写</w:t>
             </w:r>
           </w:p>
         </w:tc>
@@ -361,7 +361,7 @@
           <w:b w:val="0"/>
           <w:sz w:val="24"/>
         </w:rPr>
-        <w:t>2026年 5 月 25 日</w:t>
+        <w:t>2026年 5 月 27 日</w:t>
       </w:r>
     </w:p>
     <w:p>
@@ -2268,6 +2268,19 @@
         <w:t>六、训练设置</w:t>
       </w:r>
     </w:p>
+    <w:p>
+      <w:pPr>
+        <w:spacing w:line="360" w:lineRule="auto" w:after="0"/>
+      </w:pPr>
+      <w:r>
+        <w:rPr>
+          <w:rFonts w:ascii="宋体" w:hAnsi="宋体" w:eastAsia="宋体"/>
+          <w:b w:val="0"/>
+          <w:sz w:val="21"/>
+        </w:rPr>
+        <w:t>为保证有限标签监督实验与 FixMatch 半监督实验之间的可比性，本实验将两者的有标签 batch size 均设置为 64。FixMatch 额外引入无标签样本，其无标签 batch size 由参数 μ 控制。本实验设置 μ=2，因此每个训练 step 同时使用 64 张有标签样本和 128 张无标签样本。这样既保证了监督信号规模一致，又体现了半监督方法利用额外无标签数据的特点。</w:t>
+      </w:r>
+    </w:p>
     <w:tbl>
       <w:tblPr>
         <w:tblStyle w:val="ad"/>
@@ -2276,19 +2289,16 @@
         <w:tblLook w:firstColumn="1" w:firstRow="1" w:lastColumn="0" w:lastRow="0" w:noHBand="0" w:noVBand="1" w:val="04A0"/>
       </w:tblPr>
       <w:tblGrid>
-        <w:gridCol w:w="1091"/>
-        <w:gridCol w:w="1091"/>
-        <w:gridCol w:w="1091"/>
-        <w:gridCol w:w="1091"/>
-        <w:gridCol w:w="1091"/>
-        <w:gridCol w:w="1091"/>
-        <w:gridCol w:w="1091"/>
-        <w:gridCol w:w="1091"/>
+        <w:gridCol w:w="1746"/>
+        <w:gridCol w:w="1746"/>
+        <w:gridCol w:w="1746"/>
+        <w:gridCol w:w="1746"/>
+        <w:gridCol w:w="1746"/>
       </w:tblGrid>
       <w:tr>
         <w:tc>
           <w:tcPr>
-            <w:tcW w:type="dxa" w:w="1091"/>
+            <w:tcW w:type="dxa" w:w="1746"/>
             <w:vAlign w:val="center"/>
           </w:tcPr>
           <w:p>
@@ -2303,13 +2313,13 @@
                 <w:b/>
                 <w:sz w:val="18"/>
               </w:rPr>
-              <w:t>实验</w:t>
-            </w:r>
-          </w:p>
-        </w:tc>
-        <w:tc>
-          <w:tcPr>
-            <w:tcW w:type="dxa" w:w="1091"/>
+              <w:t>实验名称</w:t>
+            </w:r>
+          </w:p>
+        </w:tc>
+        <w:tc>
+          <w:tcPr>
+            <w:tcW w:type="dxa" w:w="1746"/>
             <w:vAlign w:val="center"/>
           </w:tcPr>
           <w:p>
@@ -2330,7 +2340,7 @@
         </w:tc>
         <w:tc>
           <w:tcPr>
-            <w:tcW w:type="dxa" w:w="1091"/>
+            <w:tcW w:type="dxa" w:w="1746"/>
             <w:vAlign w:val="center"/>
           </w:tcPr>
           <w:p>
@@ -2345,13 +2355,13 @@
                 <w:b/>
                 <w:sz w:val="18"/>
               </w:rPr>
-              <w:t>标签比例</w:t>
-            </w:r>
-          </w:p>
-        </w:tc>
-        <w:tc>
-          <w:tcPr>
-            <w:tcW w:type="dxa" w:w="1091"/>
+              <w:t>有标签 batch size</w:t>
+            </w:r>
+          </w:p>
+        </w:tc>
+        <w:tc>
+          <w:tcPr>
+            <w:tcW w:type="dxa" w:w="1746"/>
             <w:vAlign w:val="center"/>
           </w:tcPr>
           <w:p>
@@ -2366,13 +2376,13 @@
                 <w:b/>
                 <w:sz w:val="18"/>
               </w:rPr>
-              <w:t>epoch</w:t>
-            </w:r>
-          </w:p>
-        </w:tc>
-        <w:tc>
-          <w:tcPr>
-            <w:tcW w:type="dxa" w:w="1091"/>
+              <w:t>μ</w:t>
+            </w:r>
+          </w:p>
+        </w:tc>
+        <w:tc>
+          <w:tcPr>
+            <w:tcW w:type="dxa" w:w="1746"/>
             <w:vAlign w:val="center"/>
           </w:tcPr>
           <w:p>
@@ -2387,70 +2397,7 @@
                 <w:b/>
                 <w:sz w:val="18"/>
               </w:rPr>
-              <w:t>batch</w:t>
-            </w:r>
-          </w:p>
-        </w:tc>
-        <w:tc>
-          <w:tcPr>
-            <w:tcW w:type="dxa" w:w="1091"/>
-            <w:vAlign w:val="center"/>
-          </w:tcPr>
-          <w:p>
-            <w:pPr>
-              <w:spacing w:after="0" w:line="288" w:lineRule="auto"/>
-              <w:jc w:val="center"/>
-            </w:pPr>
-            <w:r/>
-            <w:r>
-              <w:rPr>
-                <w:rFonts w:ascii="宋体" w:hAnsi="宋体" w:eastAsia="宋体"/>
-                <w:b/>
-                <w:sz w:val="18"/>
-              </w:rPr>
-              <w:t>学习率</w:t>
-            </w:r>
-          </w:p>
-        </w:tc>
-        <w:tc>
-          <w:tcPr>
-            <w:tcW w:type="dxa" w:w="1091"/>
-            <w:vAlign w:val="center"/>
-          </w:tcPr>
-          <w:p>
-            <w:pPr>
-              <w:spacing w:after="0" w:line="288" w:lineRule="auto"/>
-              <w:jc w:val="center"/>
-            </w:pPr>
-            <w:r/>
-            <w:r>
-              <w:rPr>
-                <w:rFonts w:ascii="宋体" w:hAnsi="宋体" w:eastAsia="宋体"/>
-                <w:b/>
-                <w:sz w:val="18"/>
-              </w:rPr>
-              <w:t>有标签</w:t>
-            </w:r>
-          </w:p>
-        </w:tc>
-        <w:tc>
-          <w:tcPr>
-            <w:tcW w:type="dxa" w:w="1091"/>
-            <w:vAlign w:val="center"/>
-          </w:tcPr>
-          <w:p>
-            <w:pPr>
-              <w:spacing w:after="0" w:line="288" w:lineRule="auto"/>
-              <w:jc w:val="center"/>
-            </w:pPr>
-            <w:r/>
-            <w:r>
-              <w:rPr>
-                <w:rFonts w:ascii="宋体" w:hAnsi="宋体" w:eastAsia="宋体"/>
-                <w:b/>
-                <w:sz w:val="18"/>
-              </w:rPr>
-              <w:t>无标签/未使用</w:t>
+              <w:t>无标签 batch size</w:t>
             </w:r>
           </w:p>
         </w:tc>
@@ -2458,7 +2405,7 @@
       <w:tr>
         <w:tc>
           <w:tcPr>
-            <w:tcW w:type="dxa" w:w="1091"/>
+            <w:tcW w:type="dxa" w:w="1746"/>
             <w:vAlign w:val="center"/>
           </w:tcPr>
           <w:p>
@@ -2479,7 +2426,7 @@
         </w:tc>
         <w:tc>
           <w:tcPr>
-            <w:tcW w:type="dxa" w:w="1091"/>
+            <w:tcW w:type="dxa" w:w="1746"/>
             <w:vAlign w:val="center"/>
           </w:tcPr>
           <w:p>
@@ -2500,49 +2447,7 @@
         </w:tc>
         <w:tc>
           <w:tcPr>
-            <w:tcW w:type="dxa" w:w="1091"/>
-            <w:vAlign w:val="center"/>
-          </w:tcPr>
-          <w:p>
-            <w:pPr>
-              <w:spacing w:after="0" w:line="288" w:lineRule="auto"/>
-              <w:jc w:val="center"/>
-            </w:pPr>
-            <w:r/>
-            <w:r>
-              <w:rPr>
-                <w:rFonts w:ascii="宋体" w:hAnsi="宋体" w:eastAsia="宋体"/>
-                <w:b w:val="0"/>
-                <w:sz w:val="18"/>
-              </w:rPr>
-              <w:t>1.0</w:t>
-            </w:r>
-          </w:p>
-        </w:tc>
-        <w:tc>
-          <w:tcPr>
-            <w:tcW w:type="dxa" w:w="1091"/>
-            <w:vAlign w:val="center"/>
-          </w:tcPr>
-          <w:p>
-            <w:pPr>
-              <w:spacing w:after="0" w:line="288" w:lineRule="auto"/>
-              <w:jc w:val="center"/>
-            </w:pPr>
-            <w:r/>
-            <w:r>
-              <w:rPr>
-                <w:rFonts w:ascii="宋体" w:hAnsi="宋体" w:eastAsia="宋体"/>
-                <w:b w:val="0"/>
-                <w:sz w:val="18"/>
-              </w:rPr>
-              <w:t>80</w:t>
-            </w:r>
-          </w:p>
-        </w:tc>
-        <w:tc>
-          <w:tcPr>
-            <w:tcW w:type="dxa" w:w="1091"/>
+            <w:tcW w:type="dxa" w:w="1746"/>
             <w:vAlign w:val="center"/>
           </w:tcPr>
           <w:p>
@@ -2563,64 +2468,43 @@
         </w:tc>
         <w:tc>
           <w:tcPr>
-            <w:tcW w:type="dxa" w:w="1091"/>
-            <w:vAlign w:val="center"/>
-          </w:tcPr>
-          <w:p>
-            <w:pPr>
-              <w:spacing w:after="0" w:line="288" w:lineRule="auto"/>
-              <w:jc w:val="center"/>
-            </w:pPr>
-            <w:r/>
-            <w:r>
-              <w:rPr>
-                <w:rFonts w:ascii="宋体" w:hAnsi="宋体" w:eastAsia="宋体"/>
-                <w:b w:val="0"/>
-                <w:sz w:val="18"/>
-              </w:rPr>
-              <w:t>0.001</w:t>
-            </w:r>
-          </w:p>
-        </w:tc>
-        <w:tc>
-          <w:tcPr>
-            <w:tcW w:type="dxa" w:w="1091"/>
-            <w:vAlign w:val="center"/>
-          </w:tcPr>
-          <w:p>
-            <w:pPr>
-              <w:spacing w:after="0" w:line="288" w:lineRule="auto"/>
-              <w:jc w:val="center"/>
-            </w:pPr>
-            <w:r/>
-            <w:r>
-              <w:rPr>
-                <w:rFonts w:ascii="宋体" w:hAnsi="宋体" w:eastAsia="宋体"/>
-                <w:b w:val="0"/>
-                <w:sz w:val="18"/>
-              </w:rPr>
-              <w:t>2746</w:t>
-            </w:r>
-          </w:p>
-        </w:tc>
-        <w:tc>
-          <w:tcPr>
-            <w:tcW w:type="dxa" w:w="1091"/>
-            <w:vAlign w:val="center"/>
-          </w:tcPr>
-          <w:p>
-            <w:pPr>
-              <w:spacing w:after="0" w:line="288" w:lineRule="auto"/>
-              <w:jc w:val="center"/>
-            </w:pPr>
-            <w:r/>
-            <w:r>
-              <w:rPr>
-                <w:rFonts w:ascii="宋体" w:hAnsi="宋体" w:eastAsia="宋体"/>
-                <w:b w:val="0"/>
-                <w:sz w:val="18"/>
-              </w:rPr>
-              <w:t>0</w:t>
+            <w:tcW w:type="dxa" w:w="1746"/>
+            <w:vAlign w:val="center"/>
+          </w:tcPr>
+          <w:p>
+            <w:pPr>
+              <w:spacing w:after="0" w:line="288" w:lineRule="auto"/>
+              <w:jc w:val="center"/>
+            </w:pPr>
+            <w:r/>
+            <w:r>
+              <w:rPr>
+                <w:rFonts w:ascii="宋体" w:hAnsi="宋体" w:eastAsia="宋体"/>
+                <w:b w:val="0"/>
+                <w:sz w:val="18"/>
+              </w:rPr>
+              <w:t>-</w:t>
+            </w:r>
+          </w:p>
+        </w:tc>
+        <w:tc>
+          <w:tcPr>
+            <w:tcW w:type="dxa" w:w="1746"/>
+            <w:vAlign w:val="center"/>
+          </w:tcPr>
+          <w:p>
+            <w:pPr>
+              <w:spacing w:after="0" w:line="288" w:lineRule="auto"/>
+              <w:jc w:val="center"/>
+            </w:pPr>
+            <w:r/>
+            <w:r>
+              <w:rPr>
+                <w:rFonts w:ascii="宋体" w:hAnsi="宋体" w:eastAsia="宋体"/>
+                <w:b w:val="0"/>
+                <w:sz w:val="18"/>
+              </w:rPr>
+              <w:t>-</w:t>
             </w:r>
           </w:p>
         </w:tc>
@@ -2628,7 +2512,7 @@
       <w:tr>
         <w:tc>
           <w:tcPr>
-            <w:tcW w:type="dxa" w:w="1091"/>
+            <w:tcW w:type="dxa" w:w="1746"/>
             <w:vAlign w:val="center"/>
           </w:tcPr>
           <w:p>
@@ -2649,7 +2533,7 @@
         </w:tc>
         <w:tc>
           <w:tcPr>
-            <w:tcW w:type="dxa" w:w="1091"/>
+            <w:tcW w:type="dxa" w:w="1746"/>
             <w:vAlign w:val="center"/>
           </w:tcPr>
           <w:p>
@@ -2670,49 +2554,7 @@
         </w:tc>
         <w:tc>
           <w:tcPr>
-            <w:tcW w:type="dxa" w:w="1091"/>
-            <w:vAlign w:val="center"/>
-          </w:tcPr>
-          <w:p>
-            <w:pPr>
-              <w:spacing w:after="0" w:line="288" w:lineRule="auto"/>
-              <w:jc w:val="center"/>
-            </w:pPr>
-            <w:r/>
-            <w:r>
-              <w:rPr>
-                <w:rFonts w:ascii="宋体" w:hAnsi="宋体" w:eastAsia="宋体"/>
-                <w:b w:val="0"/>
-                <w:sz w:val="18"/>
-              </w:rPr>
-              <w:t>0.1</w:t>
-            </w:r>
-          </w:p>
-        </w:tc>
-        <w:tc>
-          <w:tcPr>
-            <w:tcW w:type="dxa" w:w="1091"/>
-            <w:vAlign w:val="center"/>
-          </w:tcPr>
-          <w:p>
-            <w:pPr>
-              <w:spacing w:after="0" w:line="288" w:lineRule="auto"/>
-              <w:jc w:val="center"/>
-            </w:pPr>
-            <w:r/>
-            <w:r>
-              <w:rPr>
-                <w:rFonts w:ascii="宋体" w:hAnsi="宋体" w:eastAsia="宋体"/>
-                <w:b w:val="0"/>
-                <w:sz w:val="18"/>
-              </w:rPr>
-              <w:t>80</w:t>
-            </w:r>
-          </w:p>
-        </w:tc>
-        <w:tc>
-          <w:tcPr>
-            <w:tcW w:type="dxa" w:w="1091"/>
+            <w:tcW w:type="dxa" w:w="1746"/>
             <w:vAlign w:val="center"/>
           </w:tcPr>
           <w:p>
@@ -2733,64 +2575,43 @@
         </w:tc>
         <w:tc>
           <w:tcPr>
-            <w:tcW w:type="dxa" w:w="1091"/>
-            <w:vAlign w:val="center"/>
-          </w:tcPr>
-          <w:p>
-            <w:pPr>
-              <w:spacing w:after="0" w:line="288" w:lineRule="auto"/>
-              <w:jc w:val="center"/>
-            </w:pPr>
-            <w:r/>
-            <w:r>
-              <w:rPr>
-                <w:rFonts w:ascii="宋体" w:hAnsi="宋体" w:eastAsia="宋体"/>
-                <w:b w:val="0"/>
-                <w:sz w:val="18"/>
-              </w:rPr>
-              <w:t>0.001</w:t>
-            </w:r>
-          </w:p>
-        </w:tc>
-        <w:tc>
-          <w:tcPr>
-            <w:tcW w:type="dxa" w:w="1091"/>
-            <w:vAlign w:val="center"/>
-          </w:tcPr>
-          <w:p>
-            <w:pPr>
-              <w:spacing w:after="0" w:line="288" w:lineRule="auto"/>
-              <w:jc w:val="center"/>
-            </w:pPr>
-            <w:r/>
-            <w:r>
-              <w:rPr>
-                <w:rFonts w:ascii="宋体" w:hAnsi="宋体" w:eastAsia="宋体"/>
-                <w:b w:val="0"/>
-                <w:sz w:val="18"/>
-              </w:rPr>
-              <w:t>268</w:t>
-            </w:r>
-          </w:p>
-        </w:tc>
-        <w:tc>
-          <w:tcPr>
-            <w:tcW w:type="dxa" w:w="1091"/>
-            <w:vAlign w:val="center"/>
-          </w:tcPr>
-          <w:p>
-            <w:pPr>
-              <w:spacing w:after="0" w:line="288" w:lineRule="auto"/>
-              <w:jc w:val="center"/>
-            </w:pPr>
-            <w:r/>
-            <w:r>
-              <w:rPr>
-                <w:rFonts w:ascii="宋体" w:hAnsi="宋体" w:eastAsia="宋体"/>
-                <w:b w:val="0"/>
-                <w:sz w:val="18"/>
-              </w:rPr>
-              <w:t>2478</w:t>
+            <w:tcW w:type="dxa" w:w="1746"/>
+            <w:vAlign w:val="center"/>
+          </w:tcPr>
+          <w:p>
+            <w:pPr>
+              <w:spacing w:after="0" w:line="288" w:lineRule="auto"/>
+              <w:jc w:val="center"/>
+            </w:pPr>
+            <w:r/>
+            <w:r>
+              <w:rPr>
+                <w:rFonts w:ascii="宋体" w:hAnsi="宋体" w:eastAsia="宋体"/>
+                <w:b w:val="0"/>
+                <w:sz w:val="18"/>
+              </w:rPr>
+              <w:t>-</w:t>
+            </w:r>
+          </w:p>
+        </w:tc>
+        <w:tc>
+          <w:tcPr>
+            <w:tcW w:type="dxa" w:w="1746"/>
+            <w:vAlign w:val="center"/>
+          </w:tcPr>
+          <w:p>
+            <w:pPr>
+              <w:spacing w:after="0" w:line="288" w:lineRule="auto"/>
+              <w:jc w:val="center"/>
+            </w:pPr>
+            <w:r/>
+            <w:r>
+              <w:rPr>
+                <w:rFonts w:ascii="宋体" w:hAnsi="宋体" w:eastAsia="宋体"/>
+                <w:b w:val="0"/>
+                <w:sz w:val="18"/>
+              </w:rPr>
+              <w:t>-</w:t>
             </w:r>
           </w:p>
         </w:tc>
@@ -2798,7 +2619,7 @@
       <w:tr>
         <w:tc>
           <w:tcPr>
-            <w:tcW w:type="dxa" w:w="1091"/>
+            <w:tcW w:type="dxa" w:w="1746"/>
             <w:vAlign w:val="center"/>
           </w:tcPr>
           <w:p>
@@ -2819,7 +2640,7 @@
         </w:tc>
         <w:tc>
           <w:tcPr>
-            <w:tcW w:type="dxa" w:w="1091"/>
+            <w:tcW w:type="dxa" w:w="1746"/>
             <w:vAlign w:val="center"/>
           </w:tcPr>
           <w:p>
@@ -2840,127 +2661,64 @@
         </w:tc>
         <w:tc>
           <w:tcPr>
-            <w:tcW w:type="dxa" w:w="1091"/>
-            <w:vAlign w:val="center"/>
-          </w:tcPr>
-          <w:p>
-            <w:pPr>
-              <w:spacing w:after="0" w:line="288" w:lineRule="auto"/>
-              <w:jc w:val="center"/>
-            </w:pPr>
-            <w:r/>
-            <w:r>
-              <w:rPr>
-                <w:rFonts w:ascii="宋体" w:hAnsi="宋体" w:eastAsia="宋体"/>
-                <w:b w:val="0"/>
-                <w:sz w:val="18"/>
-              </w:rPr>
-              <w:t>0.1</w:t>
-            </w:r>
-          </w:p>
-        </w:tc>
-        <w:tc>
-          <w:tcPr>
-            <w:tcW w:type="dxa" w:w="1091"/>
-            <w:vAlign w:val="center"/>
-          </w:tcPr>
-          <w:p>
-            <w:pPr>
-              <w:spacing w:after="0" w:line="288" w:lineRule="auto"/>
-              <w:jc w:val="center"/>
-            </w:pPr>
-            <w:r/>
-            <w:r>
-              <w:rPr>
-                <w:rFonts w:ascii="宋体" w:hAnsi="宋体" w:eastAsia="宋体"/>
-                <w:b w:val="0"/>
-                <w:sz w:val="18"/>
-              </w:rPr>
-              <w:t>80</w:t>
-            </w:r>
-          </w:p>
-        </w:tc>
-        <w:tc>
-          <w:tcPr>
-            <w:tcW w:type="dxa" w:w="1091"/>
-            <w:vAlign w:val="center"/>
-          </w:tcPr>
-          <w:p>
-            <w:pPr>
-              <w:spacing w:after="0" w:line="288" w:lineRule="auto"/>
-              <w:jc w:val="center"/>
-            </w:pPr>
-            <w:r/>
-            <w:r>
-              <w:rPr>
-                <w:rFonts w:ascii="宋体" w:hAnsi="宋体" w:eastAsia="宋体"/>
-                <w:b w:val="0"/>
-                <w:sz w:val="18"/>
-              </w:rPr>
-              <w:t>32</w:t>
-            </w:r>
-          </w:p>
-        </w:tc>
-        <w:tc>
-          <w:tcPr>
-            <w:tcW w:type="dxa" w:w="1091"/>
-            <w:vAlign w:val="center"/>
-          </w:tcPr>
-          <w:p>
-            <w:pPr>
-              <w:spacing w:after="0" w:line="288" w:lineRule="auto"/>
-              <w:jc w:val="center"/>
-            </w:pPr>
-            <w:r/>
-            <w:r>
-              <w:rPr>
-                <w:rFonts w:ascii="宋体" w:hAnsi="宋体" w:eastAsia="宋体"/>
-                <w:b w:val="0"/>
-                <w:sz w:val="18"/>
-              </w:rPr>
-              <w:t>0.001</w:t>
-            </w:r>
-          </w:p>
-        </w:tc>
-        <w:tc>
-          <w:tcPr>
-            <w:tcW w:type="dxa" w:w="1091"/>
-            <w:vAlign w:val="center"/>
-          </w:tcPr>
-          <w:p>
-            <w:pPr>
-              <w:spacing w:after="0" w:line="288" w:lineRule="auto"/>
-              <w:jc w:val="center"/>
-            </w:pPr>
-            <w:r/>
-            <w:r>
-              <w:rPr>
-                <w:rFonts w:ascii="宋体" w:hAnsi="宋体" w:eastAsia="宋体"/>
-                <w:b w:val="0"/>
-                <w:sz w:val="18"/>
-              </w:rPr>
-              <w:t>268</w:t>
-            </w:r>
-          </w:p>
-        </w:tc>
-        <w:tc>
-          <w:tcPr>
-            <w:tcW w:type="dxa" w:w="1091"/>
-            <w:vAlign w:val="center"/>
-          </w:tcPr>
-          <w:p>
-            <w:pPr>
-              <w:spacing w:after="0" w:line="288" w:lineRule="auto"/>
-              <w:jc w:val="center"/>
-            </w:pPr>
-            <w:r/>
-            <w:r>
-              <w:rPr>
-                <w:rFonts w:ascii="宋体" w:hAnsi="宋体" w:eastAsia="宋体"/>
-                <w:b w:val="0"/>
-                <w:sz w:val="18"/>
-              </w:rPr>
-              <w:t>2478</w:t>
+            <w:tcW w:type="dxa" w:w="1746"/>
+            <w:vAlign w:val="center"/>
+          </w:tcPr>
+          <w:p>
+            <w:pPr>
+              <w:spacing w:after="0" w:line="288" w:lineRule="auto"/>
+              <w:jc w:val="center"/>
+            </w:pPr>
+            <w:r/>
+            <w:r>
+              <w:rPr>
+                <w:rFonts w:ascii="宋体" w:hAnsi="宋体" w:eastAsia="宋体"/>
+                <w:b w:val="0"/>
+                <w:sz w:val="18"/>
+              </w:rPr>
+              <w:t>64</w:t>
+            </w:r>
+          </w:p>
+        </w:tc>
+        <w:tc>
+          <w:tcPr>
+            <w:tcW w:type="dxa" w:w="1746"/>
+            <w:vAlign w:val="center"/>
+          </w:tcPr>
+          <w:p>
+            <w:pPr>
+              <w:spacing w:after="0" w:line="288" w:lineRule="auto"/>
+              <w:jc w:val="center"/>
+            </w:pPr>
+            <w:r/>
+            <w:r>
+              <w:rPr>
+                <w:rFonts w:ascii="宋体" w:hAnsi="宋体" w:eastAsia="宋体"/>
+                <w:b w:val="0"/>
+                <w:sz w:val="18"/>
+              </w:rPr>
+              <w:t>2</w:t>
+            </w:r>
+          </w:p>
+        </w:tc>
+        <w:tc>
+          <w:tcPr>
+            <w:tcW w:type="dxa" w:w="1746"/>
+            <w:vAlign w:val="center"/>
+          </w:tcPr>
+          <w:p>
+            <w:pPr>
+              <w:spacing w:after="0" w:line="288" w:lineRule="auto"/>
+              <w:jc w:val="center"/>
+            </w:pPr>
+            <w:r/>
+            <w:r>
+              <w:rPr>
+                <w:rFonts w:ascii="宋体" w:hAnsi="宋体" w:eastAsia="宋体"/>
+                <w:b w:val="0"/>
+                <w:sz w:val="18"/>
+              </w:rPr>
+              <w:t>128</w:t>
             </w:r>
           </w:p>
         </w:tc>
@@ -2977,7 +2735,20 @@
           <w:b w:val="0"/>
           <w:sz w:val="18"/>
         </w:rPr>
-        <w:t>表2-3 三组实验训练参数</w:t>
+        <w:t>表2-3 三组实验 batch size 与半监督对照设置</w:t>
+      </w:r>
+    </w:p>
+    <w:p>
+      <w:pPr>
+        <w:spacing w:line="360" w:lineRule="auto" w:after="0"/>
+      </w:pPr>
+      <w:r>
+        <w:rPr>
+          <w:rFonts w:ascii="宋体" w:hAnsi="宋体" w:eastAsia="宋体"/>
+          <w:b w:val="0"/>
+          <w:sz w:val="21"/>
+        </w:rPr>
+        <w:t>三组实验均训练 80 个 epoch，学习率为 0.001。对于 supervised 模式，batch size 直接表示监督训练 batch size；对于 FixMatch 模式，batch-size 表示有标签 batch size，μ 控制无标签样本相对于有标签样本的倍数。</w:t>
       </w:r>
     </w:p>
     <w:p>
@@ -3175,7 +2946,7 @@
                 <w:b w:val="0"/>
                 <w:sz w:val="18"/>
               </w:rPr>
-              <w:t>97.61%</w:t>
+              <w:t>97.07%</w:t>
             </w:r>
           </w:p>
         </w:tc>
@@ -3217,7 +2988,7 @@
                 <w:b w:val="0"/>
                 <w:sz w:val="18"/>
               </w:rPr>
-              <w:t>96.70%</w:t>
+              <w:t>96.49%</w:t>
             </w:r>
           </w:p>
         </w:tc>
@@ -3238,7 +3009,7 @@
                 <w:b w:val="0"/>
                 <w:sz w:val="18"/>
               </w:rPr>
-              <w:t>0.1609</w:t>
+              <w:t>0.1752</w:t>
             </w:r>
           </w:p>
         </w:tc>
@@ -3259,7 +3030,7 @@
                 <w:b w:val="0"/>
                 <w:sz w:val="18"/>
               </w:rPr>
-              <w:t>417.22s</w:t>
+              <w:t>310.01s</w:t>
             </w:r>
           </w:p>
         </w:tc>
@@ -3303,7 +3074,7 @@
                 <w:b w:val="0"/>
                 <w:sz w:val="18"/>
               </w:rPr>
-              <w:t>78.68%</w:t>
+              <w:t>73.65%</w:t>
             </w:r>
           </w:p>
         </w:tc>
@@ -3324,7 +3095,7 @@
                 <w:b w:val="0"/>
                 <w:sz w:val="18"/>
               </w:rPr>
-              <w:t>60</w:t>
+              <w:t>54</w:t>
             </w:r>
           </w:p>
         </w:tc>
@@ -3345,7 +3116,7 @@
                 <w:b w:val="0"/>
                 <w:sz w:val="18"/>
               </w:rPr>
-              <w:t>57.90%</w:t>
+              <w:t>58.23%</w:t>
             </w:r>
           </w:p>
         </w:tc>
@@ -3366,7 +3137,7 @@
                 <w:b w:val="0"/>
                 <w:sz w:val="18"/>
               </w:rPr>
-              <w:t>2.1327</w:t>
+              <w:t>2.2320</w:t>
             </w:r>
           </w:p>
         </w:tc>
@@ -3387,7 +3158,7 @@
                 <w:b w:val="0"/>
                 <w:sz w:val="18"/>
               </w:rPr>
-              <w:t>72.37s</w:t>
+              <w:t>121.57s</w:t>
             </w:r>
           </w:p>
         </w:tc>
@@ -3431,7 +3202,7 @@
                 <w:b w:val="0"/>
                 <w:sz w:val="18"/>
               </w:rPr>
-              <w:t>87.46%</w:t>
+              <w:t>82.60%</w:t>
             </w:r>
           </w:p>
         </w:tc>
@@ -3452,7 +3223,7 @@
                 <w:b w:val="0"/>
                 <w:sz w:val="18"/>
               </w:rPr>
-              <w:t>34</w:t>
+              <w:t>68</w:t>
             </w:r>
           </w:p>
         </w:tc>
@@ -3473,7 +3244,7 @@
                 <w:b w:val="0"/>
                 <w:sz w:val="18"/>
               </w:rPr>
-              <w:t>78.35%</w:t>
+              <w:t>75.96%</w:t>
             </w:r>
           </w:p>
         </w:tc>
@@ -3494,7 +3265,7 @@
                 <w:b w:val="0"/>
                 <w:sz w:val="18"/>
               </w:rPr>
-              <w:t>1.0197</w:t>
+              <w:t>1.5937</w:t>
             </w:r>
           </w:p>
         </w:tc>
@@ -3515,7 +3286,7 @@
                 <w:b w:val="0"/>
                 <w:sz w:val="18"/>
               </w:rPr>
-              <w:t>232.54s</w:t>
+              <w:t>376.40s</w:t>
             </w:r>
           </w:p>
         </w:tc>
@@ -3545,7 +3316,7 @@
           <w:b w:val="0"/>
           <w:sz w:val="21"/>
         </w:rPr>
-        <w:t>全标签监督模型最优测试精度为 97.61%，作为本分类网络在该数据集上的参考上限。当标签减少到 10% 时，监督模型最优测试精度下降到 78.68%，下降 18.93 个百分点，说明深度分类网络对标注样本数量较为敏感。FixMatch 在相同 268 张有标签样本基础上使用 2478 张无标签样本，最优测试精度提升到 87.46%，相对 10% 监督实验提升 8.78 个百分点，恢复了约 46.4% 的精度损失。</w:t>
+        <w:t>全标签监督模型最优测试精度为 97.07%，作为本分类网络在该数据集上的参考上限。当标签减少到 10% 时，监督模型最优测试精度下降到 73.65%，下降 23.42 个百分点，说明深度分类网络对标注样本数量较为敏感。FixMatch 在相同 268 张有标签样本基础上使用 2478 张无标签样本，最优测试精度提升到 82.60%，相对 10% 监督实验提升 8.95 个百分点，恢复了约 38.2% 的精度损失。</w:t>
       </w:r>
     </w:p>
     <w:p>

</xml_diff>